<commit_message>
add new version of the system
</commit_message>
<xml_diff>
--- a/docs/phishing_research.docx
+++ b/docs/phishing_research.docx
@@ -61,7 +61,6 @@
         </w:tabs>
         <w:bidi/>
         <w:rPr>
-          <w:rFonts w:hint="cs"/>
           <w:color w:val="000000" w:themeColor="text1"/>
           <w:lang w:bidi="he-IL"/>
         </w:rPr>
@@ -101,7 +100,6 @@
         <w:bidi/>
         <w:spacing w:after="120"/>
         <w:rPr>
-          <w:rFonts w:hint="cs"/>
           <w:color w:val="000000" w:themeColor="text1"/>
           <w:lang w:bidi="he-IL"/>
         </w:rPr>
@@ -445,15 +443,7 @@
           <w:iCs/>
           <w:color w:val="000000" w:themeColor="text1"/>
         </w:rPr>
-        <w:t>paypa</w:t>
-      </w:r>
-      <w:r>
-        <w:rPr>
-          <w:i/>
-          <w:iCs/>
-          <w:color w:val="000000" w:themeColor="text1"/>
-        </w:rPr>
-        <w:t>1.com / gooogle.com / arnazon.com</w:t>
+        <w:t>paypa1.com / gooogle.com / arnazon.com</w:t>
       </w:r>
     </w:p>
     <w:p>
@@ -470,7 +460,6 @@
         <w:bidi/>
         <w:spacing w:after="120"/>
         <w:rPr>
-          <w:rFonts w:hint="cs"/>
           <w:color w:val="000000" w:themeColor="text1"/>
           <w:rtl/>
           <w:lang w:val="en-US" w:bidi="he-IL"/>
@@ -625,7 +614,6 @@
         <w:bidi/>
         <w:spacing w:after="120"/>
         <w:rPr>
-          <w:rFonts w:hint="cs"/>
           <w:color w:val="000000" w:themeColor="text1"/>
           <w:rtl/>
           <w:lang w:bidi="he-IL"/>
@@ -709,13 +697,7 @@
           <w:color w:val="000000" w:themeColor="text1"/>
         </w:rPr>
         <w:lastRenderedPageBreak/>
-        <w:t>4</w:t>
-      </w:r>
-      <w:r>
-        <w:rPr>
-          <w:color w:val="000000" w:themeColor="text1"/>
-        </w:rPr>
-        <w:t xml:space="preserve"> </w:t>
+        <w:t xml:space="preserve">4 </w:t>
       </w:r>
       <w:r>
         <w:rPr>
@@ -760,7 +742,6 @@
               <w:bidi/>
               <w:spacing w:after="160"/>
               <w:rPr>
-                <w:rFonts w:hint="cs"/>
                 <w:color w:val="000000" w:themeColor="text1"/>
                 <w:lang w:bidi="he-IL"/>
               </w:rPr>
@@ -785,7 +766,6 @@
               <w:bidi/>
               <w:spacing w:after="160"/>
               <w:rPr>
-                <w:rFonts w:hint="cs"/>
                 <w:color w:val="000000" w:themeColor="text1"/>
                 <w:lang w:bidi="he-IL"/>
               </w:rPr>
@@ -810,7 +790,6 @@
               <w:spacing w:after="160"/>
               <w:jc w:val="right"/>
               <w:rPr>
-                <w:rFonts w:hint="cs"/>
                 <w:color w:val="000000" w:themeColor="text1"/>
                 <w:lang w:bidi="he-IL"/>
               </w:rPr>
@@ -835,7 +814,6 @@
               <w:bidi/>
               <w:spacing w:after="160"/>
               <w:rPr>
-                <w:rFonts w:hint="cs"/>
                 <w:color w:val="000000" w:themeColor="text1"/>
                 <w:rtl/>
                 <w:lang w:bidi="he-IL"/>
@@ -861,7 +839,6 @@
               <w:bidi/>
               <w:spacing w:after="160"/>
               <w:rPr>
-                <w:rFonts w:hint="cs"/>
                 <w:color w:val="000000" w:themeColor="text1"/>
                 <w:lang w:val="en-US" w:bidi="he-IL"/>
               </w:rPr>
@@ -958,7 +935,6 @@
               <w:bidi/>
               <w:spacing w:after="160"/>
               <w:rPr>
-                <w:rFonts w:hint="cs"/>
                 <w:color w:val="000000" w:themeColor="text1"/>
                 <w:lang w:bidi="he-IL"/>
               </w:rPr>
@@ -1019,7 +995,6 @@
               <w:bidi/>
               <w:spacing w:after="160"/>
               <w:rPr>
-                <w:rFonts w:hint="cs"/>
                 <w:color w:val="000000" w:themeColor="text1"/>
                 <w:rtl/>
                 <w:lang w:val="en-US" w:bidi="he-IL"/>
@@ -1167,7 +1142,6 @@
               <w:bidi/>
               <w:spacing w:after="160"/>
               <w:rPr>
-                <w:rFonts w:hint="cs"/>
                 <w:color w:val="000000" w:themeColor="text1"/>
                 <w:rtl/>
                 <w:lang w:val="en-US" w:bidi="he-IL"/>
@@ -1267,7 +1241,6 @@
               <w:bidi/>
               <w:spacing w:after="160"/>
               <w:rPr>
-                <w:rFonts w:hint="cs"/>
                 <w:color w:val="000000" w:themeColor="text1"/>
                 <w:rtl/>
                 <w:lang w:val="en-US" w:bidi="he-IL"/>
@@ -1358,7 +1331,6 @@
               <w:bidi/>
               <w:spacing w:after="160"/>
               <w:rPr>
-                <w:rFonts w:hint="cs"/>
                 <w:color w:val="000000" w:themeColor="text1"/>
                 <w:rtl/>
                 <w:lang w:val="en-US" w:bidi="he-IL"/>
@@ -1413,7 +1385,6 @@
             <w:pPr>
               <w:spacing w:after="160"/>
               <w:rPr>
-                <w:rFonts w:hint="cs"/>
                 <w:color w:val="000000" w:themeColor="text1"/>
                 <w:rtl/>
                 <w:lang w:val="en-US" w:bidi="he-IL"/>
@@ -1448,7 +1419,6 @@
               <w:bidi/>
               <w:spacing w:after="160"/>
               <w:rPr>
-                <w:rFonts w:hint="cs"/>
                 <w:color w:val="000000" w:themeColor="text1"/>
                 <w:rtl/>
                 <w:lang w:val="en-US" w:bidi="he-IL"/>
@@ -1521,7 +1491,6 @@
               <w:bidi/>
               <w:spacing w:after="160"/>
               <w:rPr>
-                <w:rFonts w:hint="cs"/>
                 <w:color w:val="000000" w:themeColor="text1"/>
                 <w:lang w:bidi="he-IL"/>
               </w:rPr>
@@ -1574,7 +1543,6 @@
               <w:bidi/>
               <w:spacing w:after="160"/>
               <w:rPr>
-                <w:rFonts w:hint="cs"/>
                 <w:color w:val="000000" w:themeColor="text1"/>
                 <w:rtl/>
                 <w:lang w:val="en-US" w:bidi="he-IL"/>
@@ -1648,7 +1616,6 @@
               <w:bidi/>
               <w:spacing w:after="160"/>
               <w:rPr>
-                <w:rFonts w:hint="cs"/>
                 <w:color w:val="000000" w:themeColor="text1"/>
                 <w:lang w:bidi="he-IL"/>
               </w:rPr>
@@ -1673,7 +1640,6 @@
               <w:bidi/>
               <w:spacing w:after="160"/>
               <w:rPr>
-                <w:rFonts w:hint="cs"/>
                 <w:color w:val="000000" w:themeColor="text1"/>
                 <w:rtl/>
                 <w:lang w:bidi="he-IL"/>
@@ -1772,7 +1738,6 @@
               <w:bidi/>
               <w:spacing w:after="160"/>
               <w:rPr>
-                <w:rFonts w:hint="cs"/>
                 <w:color w:val="000000" w:themeColor="text1"/>
                 <w:rtl/>
                 <w:lang w:val="en-US" w:bidi="he-IL"/>
@@ -1814,7 +1779,6 @@
               <w:bidi/>
               <w:spacing w:after="160"/>
               <w:rPr>
-                <w:rFonts w:hint="cs"/>
                 <w:color w:val="000000" w:themeColor="text1"/>
                 <w:lang w:bidi="he-IL"/>
               </w:rPr>
@@ -1839,7 +1803,6 @@
               <w:bidi/>
               <w:spacing w:after="160"/>
               <w:rPr>
-                <w:rFonts w:hint="cs"/>
                 <w:color w:val="000000" w:themeColor="text1"/>
                 <w:lang w:bidi="he-IL"/>
               </w:rPr>
@@ -1903,7 +1866,6 @@
             <w:pPr>
               <w:spacing w:after="160"/>
               <w:rPr>
-                <w:rFonts w:hint="cs"/>
                 <w:color w:val="000000" w:themeColor="text1"/>
                 <w:rtl/>
                 <w:lang w:val="en-US" w:bidi="he-IL"/>
@@ -1936,7 +1898,6 @@
               <w:bidi/>
               <w:spacing w:after="160"/>
               <w:rPr>
-                <w:rFonts w:hint="cs"/>
                 <w:color w:val="000000" w:themeColor="text1"/>
                 <w:lang w:bidi="he-IL"/>
               </w:rPr>
@@ -1982,7 +1943,6 @@
               <w:bidi/>
               <w:spacing w:after="160"/>
               <w:rPr>
-                <w:rFonts w:hint="cs"/>
                 <w:color w:val="000000" w:themeColor="text1"/>
                 <w:rtl/>
                 <w:lang w:val="en-US" w:bidi="he-IL"/>
@@ -2044,7 +2004,6 @@
             <w:pPr>
               <w:spacing w:after="160"/>
               <w:rPr>
-                <w:rFonts w:hint="cs"/>
                 <w:color w:val="000000" w:themeColor="text1"/>
                 <w:rtl/>
                 <w:lang w:val="en-US" w:bidi="he-IL"/>
@@ -2070,7 +2029,6 @@
               <w:bidi/>
               <w:spacing w:after="160"/>
               <w:rPr>
-                <w:rFonts w:hint="cs"/>
                 <w:color w:val="000000" w:themeColor="text1"/>
                 <w:rtl/>
                 <w:lang w:val="en-US" w:bidi="he-IL"/>
@@ -2127,7 +2085,6 @@
               <w:bidi/>
               <w:spacing w:after="160"/>
               <w:rPr>
-                <w:rFonts w:hint="cs"/>
                 <w:color w:val="000000" w:themeColor="text1"/>
                 <w:rtl/>
                 <w:lang w:val="en-US" w:bidi="he-IL"/>
@@ -2190,7 +2147,6 @@
             <w:pPr>
               <w:spacing w:after="160"/>
               <w:rPr>
-                <w:rFonts w:hint="cs"/>
                 <w:color w:val="000000" w:themeColor="text1"/>
                 <w:rtl/>
                 <w:lang w:val="en-US" w:bidi="he-IL"/>
@@ -2224,7 +2180,6 @@
               <w:bidi/>
               <w:spacing w:after="160"/>
               <w:rPr>
-                <w:rFonts w:hint="cs"/>
                 <w:color w:val="000000" w:themeColor="text1"/>
                 <w:rtl/>
                 <w:lang w:val="en-US" w:bidi="he-IL"/>
@@ -2275,14 +2230,7 @@
                 <w:rtl/>
                 <w:lang w:bidi="he-IL"/>
               </w:rPr>
-              <w:t xml:space="preserve"> </w:t>
-            </w:r>
-            <w:r>
-              <w:rPr>
-                <w:rtl/>
-                <w:lang w:bidi="he-IL"/>
-              </w:rPr>
-              <w:t>לקוח יקר החשבון שלך נמצא בהשעי</w:t>
+              <w:t xml:space="preserve"> לקוח יקר החשבון שלך נמצא בהשעי</w:t>
             </w:r>
             <w:r>
               <w:rPr>
@@ -2319,7 +2267,6 @@
               <w:bidi/>
               <w:spacing w:after="160"/>
               <w:rPr>
-                <w:rFonts w:hint="cs"/>
                 <w:color w:val="000000" w:themeColor="text1"/>
                 <w:rtl/>
                 <w:lang w:val="en-US" w:bidi="he-IL"/>
@@ -2382,7 +2329,6 @@
             <w:pPr>
               <w:spacing w:after="160"/>
               <w:rPr>
-                <w:rFonts w:hint="cs"/>
                 <w:color w:val="000000" w:themeColor="text1"/>
                 <w:rtl/>
                 <w:lang w:val="en-US" w:bidi="he-IL"/>
@@ -2411,7 +2357,6 @@
               <w:bidi/>
               <w:spacing w:after="160"/>
               <w:rPr>
-                <w:rFonts w:hint="cs"/>
                 <w:color w:val="000000" w:themeColor="text1"/>
                 <w:rtl/>
                 <w:lang w:val="en-US" w:bidi="he-IL"/>
@@ -2458,7 +2403,6 @@
               <w:bidi/>
               <w:spacing w:after="160"/>
               <w:rPr>
-                <w:rFonts w:hint="cs"/>
                 <w:color w:val="000000" w:themeColor="text1"/>
                 <w:rtl/>
                 <w:lang w:val="en-US" w:bidi="he-IL"/>
@@ -2613,16 +2557,7 @@
           <w:rtl/>
           <w:lang w:bidi="he-IL"/>
         </w:rPr>
-        <w:t>כל קריטריון מקבל ניקוד על פי חומרתו ורמת האזהרה שלו, המערכת סורקת את הטקסט ועוברת על כל קריטריון בנפרד וצוברת ניקוד</w:t>
-      </w:r>
-      <w:r>
-        <w:rPr>
-          <w:rFonts w:hint="cs"/>
-          <w:color w:val="000000" w:themeColor="text1"/>
-          <w:rtl/>
-          <w:lang w:bidi="he-IL"/>
-        </w:rPr>
-        <w:t xml:space="preserve">. </w:t>
+        <w:t xml:space="preserve">כל קריטריון מקבל ניקוד על פי חומרתו ורמת האזהרה שלו, המערכת סורקת את הטקסט ועוברת על כל קריטריון בנפרד וצוברת ניקוד. </w:t>
       </w:r>
     </w:p>
     <w:p>
@@ -2650,10 +2585,9 @@
       <w:r>
         <w:rPr>
           <w:color w:val="000000" w:themeColor="text1"/>
-          <w:rtl/>
-          <w:lang w:bidi="he-IL"/>
-        </w:rPr>
-        <w:t>–</w:t>
+          <w:lang w:val="en-US" w:bidi="he-IL"/>
+        </w:rPr>
+        <w:t>-</w:t>
       </w:r>
       <w:r>
         <w:rPr>
@@ -2688,42 +2622,17 @@
     </w:p>
     <w:p>
       <w:pPr>
-        <w:pStyle w:val="a4"/>
-        <w:bidi/>
-        <w:spacing w:after="120"/>
-        <w:ind w:left="720"/>
-        <w:rPr>
-          <w:rFonts w:hint="cs"/>
-          <w:color w:val="000000" w:themeColor="text1"/>
-          <w:rtl/>
-          <w:lang w:bidi="he-IL"/>
+        <w:spacing w:after="160"/>
+        <w:rPr>
+          <w:color w:val="000000" w:themeColor="text1"/>
         </w:rPr>
       </w:pPr>
     </w:p>
     <w:p>
       <w:pPr>
-        <w:spacing w:after="160"/>
-        <w:rPr>
-          <w:color w:val="000000" w:themeColor="text1"/>
-          <w:rtl/>
-          <w:lang w:bidi="he-IL"/>
-        </w:rPr>
-      </w:pPr>
-    </w:p>
-    <w:p>
-      <w:pPr>
-        <w:spacing w:after="160"/>
-        <w:rPr>
-          <w:color w:val="000000" w:themeColor="text1"/>
-        </w:rPr>
-      </w:pPr>
-    </w:p>
-    <w:p>
-      <w:pPr>
         <w:pStyle w:val="1"/>
         <w:bidi/>
         <w:rPr>
-          <w:rFonts w:hint="cs"/>
           <w:color w:val="000000" w:themeColor="text1"/>
           <w:lang w:bidi="he-IL"/>
         </w:rPr>
@@ -3029,37 +2938,7 @@
         <w:rPr>
           <w:color w:val="000000" w:themeColor="text1"/>
         </w:rPr>
-        <w:t xml:space="preserve">score: </w:t>
-      </w:r>
-      <w:r>
-        <w:rPr>
-          <w:color w:val="000000" w:themeColor="text1"/>
-        </w:rPr>
-        <w:t>מספר</w:t>
-      </w:r>
-      <w:r>
-        <w:rPr>
-          <w:color w:val="000000" w:themeColor="text1"/>
-        </w:rPr>
-        <w:t xml:space="preserve"> </w:t>
-      </w:r>
-      <w:r>
-        <w:rPr>
-          <w:color w:val="000000" w:themeColor="text1"/>
-        </w:rPr>
-        <w:t>הנקודות</w:t>
-      </w:r>
-      <w:r>
-        <w:rPr>
-          <w:color w:val="000000" w:themeColor="text1"/>
-        </w:rPr>
-        <w:t xml:space="preserve"> </w:t>
-      </w:r>
-      <w:r>
-        <w:rPr>
-          <w:color w:val="000000" w:themeColor="text1"/>
-        </w:rPr>
-        <w:t>שנצברו</w:t>
+        <w:t>score: מספר הנקודות שנצברו</w:t>
       </w:r>
     </w:p>
     <w:p>
@@ -5102,6 +4981,7 @@
   <w:style w:type="character" w:default="1" w:styleId="a0">
     <w:name w:val="Default Paragraph Font"/>
     <w:uiPriority w:val="1"/>
+    <w:semiHidden/>
     <w:unhideWhenUsed/>
   </w:style>
   <w:style w:type="table" w:default="1" w:styleId="a1">

</xml_diff>

<commit_message>
final version to submit
</commit_message>
<xml_diff>
--- a/docs/phishing_research.docx
+++ b/docs/phishing_research.docx
@@ -722,20 +722,23 @@
     <w:tbl>
       <w:tblPr>
         <w:tblStyle w:val="ab"/>
-        <w:tblW w:w="10060" w:type="dxa"/>
+        <w:tblW w:w="10178" w:type="dxa"/>
         <w:tblLook w:val="04A0" w:firstRow="1" w:lastRow="0" w:firstColumn="1" w:lastColumn="0" w:noHBand="0" w:noVBand="1"/>
       </w:tblPr>
       <w:tblGrid>
-        <w:gridCol w:w="1861"/>
-        <w:gridCol w:w="1905"/>
-        <w:gridCol w:w="1862"/>
-        <w:gridCol w:w="1858"/>
-        <w:gridCol w:w="2574"/>
+        <w:gridCol w:w="1883"/>
+        <w:gridCol w:w="1927"/>
+        <w:gridCol w:w="1884"/>
+        <w:gridCol w:w="1880"/>
+        <w:gridCol w:w="2604"/>
       </w:tblGrid>
       <w:tr>
+        <w:trPr>
+          <w:trHeight w:val="454"/>
+        </w:trPr>
         <w:tc>
           <w:tcPr>
-            <w:tcW w:w="1861" w:type="dxa"/>
+            <w:tcW w:w="1883" w:type="dxa"/>
           </w:tcPr>
           <w:p>
             <w:pPr>
@@ -759,7 +762,7 @@
         </w:tc>
         <w:tc>
           <w:tcPr>
-            <w:tcW w:w="1905" w:type="dxa"/>
+            <w:tcW w:w="1927" w:type="dxa"/>
           </w:tcPr>
           <w:p>
             <w:pPr>
@@ -783,7 +786,7 @@
         </w:tc>
         <w:tc>
           <w:tcPr>
-            <w:tcW w:w="1862" w:type="dxa"/>
+            <w:tcW w:w="1884" w:type="dxa"/>
           </w:tcPr>
           <w:p>
             <w:pPr>
@@ -807,7 +810,7 @@
         </w:tc>
         <w:tc>
           <w:tcPr>
-            <w:tcW w:w="1858" w:type="dxa"/>
+            <w:tcW w:w="1880" w:type="dxa"/>
           </w:tcPr>
           <w:p>
             <w:pPr>
@@ -832,7 +835,7 @@
         </w:tc>
         <w:tc>
           <w:tcPr>
-            <w:tcW w:w="2574" w:type="dxa"/>
+            <w:tcW w:w="2604" w:type="dxa"/>
           </w:tcPr>
           <w:p>
             <w:pPr>
@@ -856,9 +859,12 @@
         </w:tc>
       </w:tr>
       <w:tr>
+        <w:trPr>
+          <w:trHeight w:val="1883"/>
+        </w:trPr>
         <w:tc>
           <w:tcPr>
-            <w:tcW w:w="1861" w:type="dxa"/>
+            <w:tcW w:w="1883" w:type="dxa"/>
           </w:tcPr>
           <w:p>
             <w:pPr>
@@ -898,7 +904,7 @@
         </w:tc>
         <w:tc>
           <w:tcPr>
-            <w:tcW w:w="1905" w:type="dxa"/>
+            <w:tcW w:w="1927" w:type="dxa"/>
           </w:tcPr>
           <w:p>
             <w:pPr>
@@ -928,7 +934,7 @@
         </w:tc>
         <w:tc>
           <w:tcPr>
-            <w:tcW w:w="1862" w:type="dxa"/>
+            <w:tcW w:w="1884" w:type="dxa"/>
           </w:tcPr>
           <w:p>
             <w:pPr>
@@ -988,7 +994,7 @@
         </w:tc>
         <w:tc>
           <w:tcPr>
-            <w:tcW w:w="1858" w:type="dxa"/>
+            <w:tcW w:w="1880" w:type="dxa"/>
           </w:tcPr>
           <w:p>
             <w:pPr>
@@ -1020,7 +1026,7 @@
         </w:tc>
         <w:tc>
           <w:tcPr>
-            <w:tcW w:w="2574" w:type="dxa"/>
+            <w:tcW w:w="2604" w:type="dxa"/>
           </w:tcPr>
           <w:p>
             <w:pPr>
@@ -1039,9 +1045,12 @@
         </w:tc>
       </w:tr>
       <w:tr>
+        <w:trPr>
+          <w:trHeight w:val="1194"/>
+        </w:trPr>
         <w:tc>
           <w:tcPr>
-            <w:tcW w:w="1861" w:type="dxa"/>
+            <w:tcW w:w="1883" w:type="dxa"/>
           </w:tcPr>
           <w:p>
             <w:pPr>
@@ -1090,7 +1099,7 @@
         </w:tc>
         <w:tc>
           <w:tcPr>
-            <w:tcW w:w="1905" w:type="dxa"/>
+            <w:tcW w:w="1927" w:type="dxa"/>
           </w:tcPr>
           <w:p>
             <w:pPr>
@@ -1135,7 +1144,7 @@
         </w:tc>
         <w:tc>
           <w:tcPr>
-            <w:tcW w:w="1862" w:type="dxa"/>
+            <w:tcW w:w="1884" w:type="dxa"/>
           </w:tcPr>
           <w:p>
             <w:pPr>
@@ -1183,7 +1192,7 @@
         </w:tc>
         <w:tc>
           <w:tcPr>
-            <w:tcW w:w="1858" w:type="dxa"/>
+            <w:tcW w:w="1880" w:type="dxa"/>
           </w:tcPr>
           <w:p>
             <w:pPr>
@@ -1213,7 +1222,7 @@
         </w:tc>
         <w:tc>
           <w:tcPr>
-            <w:tcW w:w="2574" w:type="dxa"/>
+            <w:tcW w:w="2604" w:type="dxa"/>
           </w:tcPr>
           <w:p>
             <w:pPr>
@@ -1232,9 +1241,12 @@
         </w:tc>
       </w:tr>
       <w:tr>
+        <w:trPr>
+          <w:trHeight w:val="1026"/>
+        </w:trPr>
         <w:tc>
           <w:tcPr>
-            <w:tcW w:w="1861" w:type="dxa"/>
+            <w:tcW w:w="1883" w:type="dxa"/>
           </w:tcPr>
           <w:p>
             <w:pPr>
@@ -1277,7 +1289,7 @@
         </w:tc>
         <w:tc>
           <w:tcPr>
-            <w:tcW w:w="1905" w:type="dxa"/>
+            <w:tcW w:w="1927" w:type="dxa"/>
           </w:tcPr>
           <w:p>
             <w:pPr>
@@ -1324,7 +1336,7 @@
         </w:tc>
         <w:tc>
           <w:tcPr>
-            <w:tcW w:w="1862" w:type="dxa"/>
+            <w:tcW w:w="1884" w:type="dxa"/>
           </w:tcPr>
           <w:p>
             <w:pPr>
@@ -1349,7 +1361,7 @@
         </w:tc>
         <w:tc>
           <w:tcPr>
-            <w:tcW w:w="1858" w:type="dxa"/>
+            <w:tcW w:w="1880" w:type="dxa"/>
           </w:tcPr>
           <w:p>
             <w:pPr>
@@ -1379,7 +1391,7 @@
         </w:tc>
         <w:tc>
           <w:tcPr>
-            <w:tcW w:w="2574" w:type="dxa"/>
+            <w:tcW w:w="2604" w:type="dxa"/>
           </w:tcPr>
           <w:p>
             <w:pPr>
@@ -1410,9 +1422,12 @@
         </w:tc>
       </w:tr>
       <w:tr>
+        <w:trPr>
+          <w:trHeight w:val="1026"/>
+        </w:trPr>
         <w:tc>
           <w:tcPr>
-            <w:tcW w:w="1861" w:type="dxa"/>
+            <w:tcW w:w="1883" w:type="dxa"/>
           </w:tcPr>
           <w:p>
             <w:pPr>
@@ -1437,7 +1452,7 @@
         </w:tc>
         <w:tc>
           <w:tcPr>
-            <w:tcW w:w="1905" w:type="dxa"/>
+            <w:tcW w:w="1927" w:type="dxa"/>
           </w:tcPr>
           <w:p>
             <w:pPr>
@@ -1458,7 +1473,7 @@
         </w:tc>
         <w:tc>
           <w:tcPr>
-            <w:tcW w:w="1862" w:type="dxa"/>
+            <w:tcW w:w="1884" w:type="dxa"/>
           </w:tcPr>
           <w:p>
             <w:pPr>
@@ -1481,7 +1496,7 @@
         </w:tc>
         <w:tc>
           <w:tcPr>
-            <w:tcW w:w="1858" w:type="dxa"/>
+            <w:tcW w:w="1880" w:type="dxa"/>
             <w:tcBorders>
               <w:bottom w:val="single" w:sz="4" w:space="0" w:color="auto"/>
             </w:tcBorders>
@@ -1515,7 +1530,7 @@
         </w:tc>
         <w:tc>
           <w:tcPr>
-            <w:tcW w:w="2574" w:type="dxa"/>
+            <w:tcW w:w="2604" w:type="dxa"/>
           </w:tcPr>
           <w:p>
             <w:pPr>
@@ -1534,9 +1549,12 @@
         </w:tc>
       </w:tr>
       <w:tr>
+        <w:trPr>
+          <w:trHeight w:val="1311"/>
+        </w:trPr>
         <w:tc>
           <w:tcPr>
-            <w:tcW w:w="1861" w:type="dxa"/>
+            <w:tcW w:w="1883" w:type="dxa"/>
           </w:tcPr>
           <w:p>
             <w:pPr>
@@ -1609,7 +1627,7 @@
         </w:tc>
         <w:tc>
           <w:tcPr>
-            <w:tcW w:w="1905" w:type="dxa"/>
+            <w:tcW w:w="1927" w:type="dxa"/>
           </w:tcPr>
           <w:p>
             <w:pPr>
@@ -1633,7 +1651,7 @@
         </w:tc>
         <w:tc>
           <w:tcPr>
-            <w:tcW w:w="1862" w:type="dxa"/>
+            <w:tcW w:w="1884" w:type="dxa"/>
           </w:tcPr>
           <w:p>
             <w:pPr>
@@ -1658,7 +1676,7 @@
         </w:tc>
         <w:tc>
           <w:tcPr>
-            <w:tcW w:w="1858" w:type="dxa"/>
+            <w:tcW w:w="1880" w:type="dxa"/>
             <w:tcBorders>
               <w:bottom w:val="single" w:sz="4" w:space="0" w:color="auto"/>
             </w:tcBorders>
@@ -1699,7 +1717,7 @@
         </w:tc>
         <w:tc>
           <w:tcPr>
-            <w:tcW w:w="2574" w:type="dxa"/>
+            <w:tcW w:w="2604" w:type="dxa"/>
           </w:tcPr>
           <w:p>
             <w:pPr>
@@ -1729,9 +1747,12 @@
         </w:tc>
       </w:tr>
       <w:tr>
+        <w:trPr>
+          <w:trHeight w:val="1311"/>
+        </w:trPr>
         <w:tc>
           <w:tcPr>
-            <w:tcW w:w="1861" w:type="dxa"/>
+            <w:tcW w:w="1883" w:type="dxa"/>
           </w:tcPr>
           <w:p>
             <w:pPr>
@@ -1772,7 +1793,7 @@
         </w:tc>
         <w:tc>
           <w:tcPr>
-            <w:tcW w:w="1905" w:type="dxa"/>
+            <w:tcW w:w="1927" w:type="dxa"/>
           </w:tcPr>
           <w:p>
             <w:pPr>
@@ -1796,7 +1817,7 @@
         </w:tc>
         <w:tc>
           <w:tcPr>
-            <w:tcW w:w="1862" w:type="dxa"/>
+            <w:tcW w:w="1884" w:type="dxa"/>
           </w:tcPr>
           <w:p>
             <w:pPr>
@@ -1820,7 +1841,7 @@
         </w:tc>
         <w:tc>
           <w:tcPr>
-            <w:tcW w:w="1858" w:type="dxa"/>
+            <w:tcW w:w="1880" w:type="dxa"/>
             <w:tcBorders>
               <w:top w:val="single" w:sz="4" w:space="0" w:color="auto"/>
             </w:tcBorders>
@@ -1860,7 +1881,7 @@
         </w:tc>
         <w:tc>
           <w:tcPr>
-            <w:tcW w:w="2574" w:type="dxa"/>
+            <w:tcW w:w="2604" w:type="dxa"/>
           </w:tcPr>
           <w:p>
             <w:pPr>
@@ -1889,9 +1910,12 @@
         </w:tc>
       </w:tr>
       <w:tr>
+        <w:trPr>
+          <w:trHeight w:val="1867"/>
+        </w:trPr>
         <w:tc>
           <w:tcPr>
-            <w:tcW w:w="1861" w:type="dxa"/>
+            <w:tcW w:w="1883" w:type="dxa"/>
           </w:tcPr>
           <w:p>
             <w:pPr>
@@ -1915,7 +1939,7 @@
         </w:tc>
         <w:tc>
           <w:tcPr>
-            <w:tcW w:w="1905" w:type="dxa"/>
+            <w:tcW w:w="1927" w:type="dxa"/>
           </w:tcPr>
           <w:p>
             <w:pPr>
@@ -1936,7 +1960,7 @@
         </w:tc>
         <w:tc>
           <w:tcPr>
-            <w:tcW w:w="1862" w:type="dxa"/>
+            <w:tcW w:w="1884" w:type="dxa"/>
           </w:tcPr>
           <w:p>
             <w:pPr>
@@ -1961,7 +1985,7 @@
         </w:tc>
         <w:tc>
           <w:tcPr>
-            <w:tcW w:w="1858" w:type="dxa"/>
+            <w:tcW w:w="1880" w:type="dxa"/>
           </w:tcPr>
           <w:p>
             <w:pPr>
@@ -1998,7 +2022,7 @@
         </w:tc>
         <w:tc>
           <w:tcPr>
-            <w:tcW w:w="2574" w:type="dxa"/>
+            <w:tcW w:w="2604" w:type="dxa"/>
           </w:tcPr>
           <w:p>
             <w:pPr>
@@ -2020,9 +2044,12 @@
         </w:tc>
       </w:tr>
       <w:tr>
+        <w:trPr>
+          <w:trHeight w:val="1026"/>
+        </w:trPr>
         <w:tc>
           <w:tcPr>
-            <w:tcW w:w="1861" w:type="dxa"/>
+            <w:tcW w:w="1883" w:type="dxa"/>
           </w:tcPr>
           <w:p>
             <w:pPr>
@@ -2054,7 +2081,7 @@
         </w:tc>
         <w:tc>
           <w:tcPr>
-            <w:tcW w:w="1905" w:type="dxa"/>
+            <w:tcW w:w="1927" w:type="dxa"/>
           </w:tcPr>
           <w:p>
             <w:pPr>
@@ -2078,7 +2105,7 @@
         </w:tc>
         <w:tc>
           <w:tcPr>
-            <w:tcW w:w="1862" w:type="dxa"/>
+            <w:tcW w:w="1884" w:type="dxa"/>
           </w:tcPr>
           <w:p>
             <w:pPr>
@@ -2103,7 +2130,7 @@
         </w:tc>
         <w:tc>
           <w:tcPr>
-            <w:tcW w:w="1858" w:type="dxa"/>
+            <w:tcW w:w="1880" w:type="dxa"/>
           </w:tcPr>
           <w:p>
             <w:pPr>
@@ -2141,7 +2168,7 @@
         </w:tc>
         <w:tc>
           <w:tcPr>
-            <w:tcW w:w="2574" w:type="dxa"/>
+            <w:tcW w:w="2604" w:type="dxa"/>
           </w:tcPr>
           <w:p>
             <w:pPr>
@@ -2171,15 +2198,19 @@
         </w:tc>
       </w:tr>
       <w:tr>
+        <w:trPr>
+          <w:trHeight w:val="1597"/>
+        </w:trPr>
         <w:tc>
           <w:tcPr>
-            <w:tcW w:w="1861" w:type="dxa"/>
+            <w:tcW w:w="1883" w:type="dxa"/>
           </w:tcPr>
           <w:p>
             <w:pPr>
               <w:bidi/>
               <w:spacing w:after="160"/>
               <w:rPr>
+                <w:rFonts w:hint="cs"/>
                 <w:color w:val="000000" w:themeColor="text1"/>
                 <w:rtl/>
                 <w:lang w:val="en-US" w:bidi="he-IL"/>
@@ -2187,25 +2218,26 @@
             </w:pPr>
             <w:r>
               <w:rPr>
-                <w:rFonts w:hint="cs"/>
-                <w:color w:val="000000" w:themeColor="text1"/>
-                <w:rtl/>
-                <w:lang w:bidi="he-IL"/>
-              </w:rPr>
-              <w:t xml:space="preserve">ספריית </w:t>
-            </w:r>
-            <w:r>
-              <w:rPr>
-                <w:color w:val="000000" w:themeColor="text1"/>
-                <w:lang w:val="en-US" w:bidi="he-IL"/>
-              </w:rPr>
-              <w:t>spellcheck/ heuristic</w:t>
+                <w:color w:val="000000" w:themeColor="text1"/>
+                <w:lang w:val="en-US" w:bidi="he-IL"/>
+              </w:rPr>
+              <w:lastRenderedPageBreak/>
+              <w:t>Regex</w:t>
+            </w:r>
+            <w:r>
+              <w:rPr>
+                <w:rFonts w:hint="cs"/>
+                <w:color w:val="000000" w:themeColor="text1"/>
+                <w:rtl/>
+                <w:lang w:val="en-US" w:bidi="he-IL"/>
+              </w:rPr>
+              <w:t xml:space="preserve"> על שגיאות כתיב ותחביר </w:t>
             </w:r>
           </w:p>
         </w:tc>
         <w:tc>
           <w:tcPr>
-            <w:tcW w:w="1905" w:type="dxa"/>
+            <w:tcW w:w="1927" w:type="dxa"/>
           </w:tcPr>
           <w:p>
             <w:pPr>
@@ -2260,7 +2292,7 @@
         </w:tc>
         <w:tc>
           <w:tcPr>
-            <w:tcW w:w="1862" w:type="dxa"/>
+            <w:tcW w:w="1884" w:type="dxa"/>
           </w:tcPr>
           <w:p>
             <w:pPr>
@@ -2285,7 +2317,7 @@
         </w:tc>
         <w:tc>
           <w:tcPr>
-            <w:tcW w:w="1858" w:type="dxa"/>
+            <w:tcW w:w="1880" w:type="dxa"/>
           </w:tcPr>
           <w:p>
             <w:pPr>
@@ -2301,7 +2333,7 @@
                 <w:color w:val="000000" w:themeColor="text1"/>
                 <w:lang w:val="en-US" w:bidi="he-IL"/>
               </w:rPr>
-              <w:t>2</w:t>
+              <w:t>1</w:t>
             </w:r>
             <w:r>
               <w:rPr>
@@ -2323,7 +2355,7 @@
         </w:tc>
         <w:tc>
           <w:tcPr>
-            <w:tcW w:w="2574" w:type="dxa"/>
+            <w:tcW w:w="2604" w:type="dxa"/>
           </w:tcPr>
           <w:p>
             <w:pPr>
@@ -2346,11 +2378,11 @@
       </w:tr>
       <w:tr>
         <w:trPr>
-          <w:trHeight w:val="85"/>
+          <w:trHeight w:val="95"/>
         </w:trPr>
         <w:tc>
           <w:tcPr>
-            <w:tcW w:w="1861" w:type="dxa"/>
+            <w:tcW w:w="1883" w:type="dxa"/>
           </w:tcPr>
           <w:p>
             <w:pPr>
@@ -2369,13 +2401,30 @@
                 <w:rtl/>
                 <w:lang w:val="en-US" w:bidi="he-IL"/>
               </w:rPr>
-              <w:t>ספירת ! ביחס לאורך הטקסט</w:t>
+              <w:t>יותר מ 35% אותיות גדולות או 3+</w:t>
+            </w:r>
+            <w:r>
+              <w:rPr>
+                <w:rFonts w:hint="cs"/>
+                <w:color w:val="000000" w:themeColor="text1"/>
+                <w:lang w:val="en-US" w:bidi="he-IL"/>
+              </w:rPr>
+              <w:t xml:space="preserve"> </w:t>
+            </w:r>
+            <w:r>
+              <w:rPr>
+                <w:rFonts w:hint="cs"/>
+                <w:color w:val="000000" w:themeColor="text1"/>
+                <w:rtl/>
+                <w:lang w:val="en-US" w:bidi="he-IL"/>
+              </w:rPr>
+              <w:t>סימני קריאה</w:t>
             </w:r>
           </w:p>
         </w:tc>
         <w:tc>
           <w:tcPr>
-            <w:tcW w:w="1905" w:type="dxa"/>
+            <w:tcW w:w="1927" w:type="dxa"/>
           </w:tcPr>
           <w:p>
             <w:pPr>
@@ -2396,7 +2445,7 @@
         </w:tc>
         <w:tc>
           <w:tcPr>
-            <w:tcW w:w="1862" w:type="dxa"/>
+            <w:tcW w:w="1884" w:type="dxa"/>
           </w:tcPr>
           <w:p>
             <w:pPr>
@@ -2430,7 +2479,7 @@
         </w:tc>
         <w:tc>
           <w:tcPr>
-            <w:tcW w:w="1858" w:type="dxa"/>
+            <w:tcW w:w="1880" w:type="dxa"/>
           </w:tcPr>
           <w:p>
             <w:pPr>
@@ -2452,7 +2501,7 @@
         </w:tc>
         <w:tc>
           <w:tcPr>
-            <w:tcW w:w="2574" w:type="dxa"/>
+            <w:tcW w:w="2604" w:type="dxa"/>
           </w:tcPr>
           <w:p>
             <w:pPr>
@@ -2468,6 +2517,193 @@
                 <w:lang w:val="en-US"/>
               </w:rPr>
               <w:t>Excessive caps</w:t>
+            </w:r>
+          </w:p>
+        </w:tc>
+      </w:tr>
+      <w:tr>
+        <w:trPr>
+          <w:trHeight w:val="95"/>
+        </w:trPr>
+        <w:tc>
+          <w:tcPr>
+            <w:tcW w:w="1883" w:type="dxa"/>
+          </w:tcPr>
+          <w:p>
+            <w:pPr>
+              <w:bidi/>
+              <w:spacing w:after="160"/>
+              <w:rPr>
+                <w:rFonts w:hint="cs"/>
+                <w:color w:val="000000" w:themeColor="text1"/>
+                <w:rtl/>
+                <w:lang w:val="en-US" w:bidi="he-IL"/>
+              </w:rPr>
+            </w:pPr>
+            <w:r>
+              <w:rPr>
+                <w:rFonts w:hint="cs"/>
+                <w:color w:val="000000" w:themeColor="text1"/>
+                <w:rtl/>
+                <w:lang w:val="en-US" w:bidi="he-IL"/>
+              </w:rPr>
+              <w:t xml:space="preserve">שימוש בספריית </w:t>
+            </w:r>
+            <w:r>
+              <w:rPr>
+                <w:color w:val="000000" w:themeColor="text1"/>
+                <w:lang w:val="en-US" w:bidi="he-IL"/>
+              </w:rPr>
+              <w:t>spellchecker</w:t>
+            </w:r>
+            <w:r>
+              <w:rPr>
+                <w:rFonts w:hint="cs"/>
+                <w:color w:val="000000" w:themeColor="text1"/>
+                <w:rtl/>
+                <w:lang w:val="en-US" w:bidi="he-IL"/>
+              </w:rPr>
+              <w:t xml:space="preserve"> שעוברת על כל מילה ובודקת מול מילון אנגלי</w:t>
+            </w:r>
+          </w:p>
+        </w:tc>
+        <w:tc>
+          <w:tcPr>
+            <w:tcW w:w="1927" w:type="dxa"/>
+          </w:tcPr>
+          <w:p>
+            <w:pPr>
+              <w:spacing w:after="160"/>
+              <w:rPr>
+                <w:color w:val="000000" w:themeColor="text1"/>
+                <w:lang w:val="en-US" w:bidi="he-IL"/>
+              </w:rPr>
+            </w:pPr>
+            <w:r>
+              <w:rPr>
+                <w:color w:val="000000" w:themeColor="text1"/>
+                <w:lang w:val="en-US" w:bidi="he-IL"/>
+              </w:rPr>
+              <w:t>“</w:t>
+            </w:r>
+            <w:proofErr w:type="gramStart"/>
+            <w:r>
+              <w:rPr>
+                <w:color w:val="000000" w:themeColor="text1"/>
+                <w:lang w:val="en-US" w:bidi="he-IL"/>
+              </w:rPr>
+              <w:t>your</w:t>
+            </w:r>
+            <w:proofErr w:type="gramEnd"/>
+            <w:r>
+              <w:rPr>
+                <w:color w:val="000000" w:themeColor="text1"/>
+                <w:lang w:val="en-US" w:bidi="he-IL"/>
+              </w:rPr>
+              <w:t xml:space="preserve"> </w:t>
+            </w:r>
+            <w:proofErr w:type="spellStart"/>
+            <w:r>
+              <w:rPr>
+                <w:color w:val="000000" w:themeColor="text1"/>
+                <w:lang w:val="en-US" w:bidi="he-IL"/>
+              </w:rPr>
+              <w:t>acount</w:t>
+            </w:r>
+            <w:proofErr w:type="spellEnd"/>
+            <w:r>
+              <w:rPr>
+                <w:color w:val="000000" w:themeColor="text1"/>
+                <w:lang w:val="en-US" w:bidi="he-IL"/>
+              </w:rPr>
+              <w:t xml:space="preserve"> is been </w:t>
+            </w:r>
+            <w:proofErr w:type="spellStart"/>
+            <w:r>
+              <w:rPr>
+                <w:color w:val="000000" w:themeColor="text1"/>
+                <w:lang w:val="en-US" w:bidi="he-IL"/>
+              </w:rPr>
+              <w:t>compromized</w:t>
+            </w:r>
+            <w:proofErr w:type="spellEnd"/>
+            <w:r>
+              <w:rPr>
+                <w:color w:val="000000" w:themeColor="text1"/>
+                <w:lang w:val="en-US" w:bidi="he-IL"/>
+              </w:rPr>
+              <w:t>”</w:t>
+            </w:r>
+          </w:p>
+        </w:tc>
+        <w:tc>
+          <w:tcPr>
+            <w:tcW w:w="1884" w:type="dxa"/>
+          </w:tcPr>
+          <w:p>
+            <w:pPr>
+              <w:bidi/>
+              <w:spacing w:after="160"/>
+              <w:rPr>
+                <w:rFonts w:hint="cs"/>
+                <w:color w:val="000000" w:themeColor="text1"/>
+                <w:rtl/>
+                <w:lang w:val="en-US" w:bidi="he-IL"/>
+              </w:rPr>
+            </w:pPr>
+            <w:r>
+              <w:rPr>
+                <w:rFonts w:hint="cs"/>
+                <w:color w:val="000000" w:themeColor="text1"/>
+                <w:rtl/>
+                <w:lang w:val="en-US" w:bidi="he-IL"/>
+              </w:rPr>
+              <w:t>מילים שגויות באנגלית</w:t>
+            </w:r>
+          </w:p>
+        </w:tc>
+        <w:tc>
+          <w:tcPr>
+            <w:tcW w:w="1880" w:type="dxa"/>
+          </w:tcPr>
+          <w:p>
+            <w:pPr>
+              <w:bidi/>
+              <w:spacing w:after="160"/>
+              <w:rPr>
+                <w:color w:val="000000" w:themeColor="text1"/>
+                <w:lang w:val="en-US" w:bidi="he-IL"/>
+              </w:rPr>
+            </w:pPr>
+            <w:r>
+              <w:rPr>
+                <w:color w:val="000000" w:themeColor="text1"/>
+                <w:lang w:val="en-US" w:bidi="he-IL"/>
+              </w:rPr>
+              <w:t>Low - 1</w:t>
+            </w:r>
+          </w:p>
+        </w:tc>
+        <w:tc>
+          <w:tcPr>
+            <w:tcW w:w="2604" w:type="dxa"/>
+          </w:tcPr>
+          <w:p>
+            <w:pPr>
+              <w:spacing w:after="160"/>
+              <w:rPr>
+                <w:rFonts w:hint="cs"/>
+                <w:color w:val="000000" w:themeColor="text1"/>
+                <w:rtl/>
+                <w:lang w:val="en-US" w:bidi="he-IL"/>
+              </w:rPr>
+            </w:pPr>
+            <w:r>
+              <w:rPr>
+                <w:color w:val="000000" w:themeColor="text1"/>
+                <w:lang w:val="en-US" w:bidi="he-IL"/>
+              </w:rPr>
+              <w:t xml:space="preserve">Spelling </w:t>
             </w:r>
           </w:p>
         </w:tc>
@@ -2494,7 +2730,6 @@
           <w:rtl/>
           <w:lang w:bidi="he-IL"/>
         </w:rPr>
-        <w:lastRenderedPageBreak/>
         <w:t xml:space="preserve">סיבת הניקוד לכל קריטריון: אם יש סימנים שכמעט אף פעם לא הגיוני שיהיו בהודעה יסומנו כ </w:t>
       </w:r>
       <w:r>
@@ -2548,16 +2783,186 @@
         <w:spacing w:after="120"/>
         <w:rPr>
           <w:color w:val="000000" w:themeColor="text1"/>
-        </w:rPr>
-      </w:pPr>
-      <w:r>
-        <w:rPr>
-          <w:rFonts w:hint="cs"/>
-          <w:color w:val="000000" w:themeColor="text1"/>
-          <w:rtl/>
-          <w:lang w:bidi="he-IL"/>
-        </w:rPr>
-        <w:t xml:space="preserve">כל קריטריון מקבל ניקוד על פי חומרתו ורמת האזהרה שלו, המערכת סורקת את הטקסט ועוברת על כל קריטריון בנפרד וצוברת ניקוד. </w:t>
+          <w:lang w:bidi="he-IL"/>
+        </w:rPr>
+      </w:pPr>
+      <w:r>
+        <w:rPr>
+          <w:rFonts w:hint="cs"/>
+          <w:color w:val="000000" w:themeColor="text1"/>
+          <w:rtl/>
+          <w:lang w:val="en-US" w:bidi="he-IL"/>
+        </w:rPr>
+        <w:t xml:space="preserve">איך הוחלט איזה ניקוד כל קריטריון יקבל: קודם פעלתי לפי ההיגיון ואיך בדרך כלל </w:t>
+      </w:r>
+      <w:proofErr w:type="spellStart"/>
+      <w:r>
+        <w:rPr>
+          <w:rFonts w:hint="cs"/>
+          <w:color w:val="000000" w:themeColor="text1"/>
+          <w:rtl/>
+          <w:lang w:val="en-US" w:bidi="he-IL"/>
+        </w:rPr>
+        <w:t>נראת</w:t>
+      </w:r>
+      <w:proofErr w:type="spellEnd"/>
+      <w:r>
+        <w:rPr>
+          <w:rFonts w:hint="cs"/>
+          <w:color w:val="000000" w:themeColor="text1"/>
+          <w:rtl/>
+          <w:lang w:val="en-US" w:bidi="he-IL"/>
+        </w:rPr>
+        <w:t xml:space="preserve"> הודעות </w:t>
+      </w:r>
+      <w:proofErr w:type="spellStart"/>
+      <w:r>
+        <w:rPr>
+          <w:rFonts w:hint="cs"/>
+          <w:color w:val="000000" w:themeColor="text1"/>
+          <w:rtl/>
+          <w:lang w:val="en-US" w:bidi="he-IL"/>
+        </w:rPr>
+        <w:t>פישינג</w:t>
+      </w:r>
+      <w:proofErr w:type="spellEnd"/>
+      <w:r>
+        <w:rPr>
+          <w:rFonts w:hint="cs"/>
+          <w:color w:val="000000" w:themeColor="text1"/>
+          <w:rtl/>
+          <w:lang w:val="en-US" w:bidi="he-IL"/>
+        </w:rPr>
+        <w:t xml:space="preserve"> אבל בשביל להוכיח את זה ובשביל למצוא את האיזון המושלם שיתפוס כמה שיותר הודעות, נעשה </w:t>
+      </w:r>
+      <w:r>
+        <w:rPr>
+          <w:color w:val="000000" w:themeColor="text1"/>
+          <w:lang w:val="en-US" w:bidi="he-IL"/>
+        </w:rPr>
+        <w:t xml:space="preserve">brute force </w:t>
+      </w:r>
+      <w:r>
+        <w:rPr>
+          <w:rFonts w:hint="cs"/>
+          <w:color w:val="000000" w:themeColor="text1"/>
+          <w:rtl/>
+          <w:lang w:val="en-US" w:bidi="he-IL"/>
+        </w:rPr>
+        <w:t xml:space="preserve"> </w:t>
+      </w:r>
+      <w:r>
+        <w:rPr>
+          <w:rFonts w:hint="cs"/>
+          <w:color w:val="000000" w:themeColor="text1"/>
+          <w:rtl/>
+          <w:lang w:val="en-US" w:bidi="he-IL"/>
+        </w:rPr>
+        <w:t>של כל הצירופים האפשריים לשיוך קריטריונים לרמות סיכון -&gt; התוצאה היא שהסידור שקיים כרגע נכון כי כל מה שב</w:t>
+      </w:r>
+      <w:r>
+        <w:rPr>
+          <w:rFonts w:hint="cs"/>
+          <w:color w:val="000000" w:themeColor="text1"/>
+          <w:lang w:val="en-US" w:bidi="he-IL"/>
+        </w:rPr>
+        <w:t>HIGH</w:t>
+      </w:r>
+      <w:r>
+        <w:rPr>
+          <w:rFonts w:hint="cs"/>
+          <w:color w:val="000000" w:themeColor="text1"/>
+          <w:rtl/>
+          <w:lang w:val="en-US" w:bidi="he-IL"/>
+        </w:rPr>
+        <w:t xml:space="preserve"> תמיד היה בהודעות </w:t>
+      </w:r>
+      <w:proofErr w:type="spellStart"/>
+      <w:r>
+        <w:rPr>
+          <w:rFonts w:hint="cs"/>
+          <w:color w:val="000000" w:themeColor="text1"/>
+          <w:rtl/>
+          <w:lang w:val="en-US" w:bidi="he-IL"/>
+        </w:rPr>
+        <w:t>פישינג</w:t>
+      </w:r>
+      <w:proofErr w:type="spellEnd"/>
+      <w:r>
+        <w:rPr>
+          <w:rFonts w:hint="cs"/>
+          <w:color w:val="000000" w:themeColor="text1"/>
+          <w:rtl/>
+          <w:lang w:val="en-US" w:bidi="he-IL"/>
+        </w:rPr>
+        <w:t xml:space="preserve"> כל מה שב</w:t>
+      </w:r>
+      <w:r>
+        <w:rPr>
+          <w:rFonts w:hint="cs"/>
+          <w:color w:val="000000" w:themeColor="text1"/>
+          <w:lang w:val="en-US" w:bidi="he-IL"/>
+        </w:rPr>
+        <w:t>MED</w:t>
+      </w:r>
+      <w:r>
+        <w:rPr>
+          <w:rFonts w:hint="cs"/>
+          <w:color w:val="000000" w:themeColor="text1"/>
+          <w:rtl/>
+          <w:lang w:val="en-US" w:bidi="he-IL"/>
+        </w:rPr>
+        <w:t xml:space="preserve"> היה בין 70 ל40 אחוז מההודעות והשאר שב</w:t>
+      </w:r>
+      <w:r>
+        <w:rPr>
+          <w:rFonts w:hint="cs"/>
+          <w:color w:val="000000" w:themeColor="text1"/>
+          <w:lang w:val="en-US" w:bidi="he-IL"/>
+        </w:rPr>
+        <w:t>MED</w:t>
+      </w:r>
+      <w:r>
+        <w:rPr>
+          <w:rFonts w:hint="cs"/>
+          <w:color w:val="000000" w:themeColor="text1"/>
+          <w:rtl/>
+          <w:lang w:val="en-US" w:bidi="he-IL"/>
+        </w:rPr>
+        <w:t xml:space="preserve"> היו אקראיים ויכולים גם להיות בהודעה לגיטימית, ואלה שב</w:t>
+      </w:r>
+      <w:r>
+        <w:rPr>
+          <w:rFonts w:hint="cs"/>
+          <w:color w:val="000000" w:themeColor="text1"/>
+          <w:lang w:val="en-US" w:bidi="he-IL"/>
+        </w:rPr>
+        <w:t>LOW</w:t>
+      </w:r>
+      <w:r>
+        <w:rPr>
+          <w:rFonts w:hint="cs"/>
+          <w:color w:val="000000" w:themeColor="text1"/>
+          <w:rtl/>
+          <w:lang w:val="en-US" w:bidi="he-IL"/>
+        </w:rPr>
+        <w:t xml:space="preserve"> היו פחות מ30 אחוז מההודעות כיום אך יכולים למנוע </w:t>
+      </w:r>
+      <w:r>
+        <w:rPr>
+          <w:color w:val="000000" w:themeColor="text1"/>
+          <w:lang w:val="en-US" w:bidi="he-IL"/>
+        </w:rPr>
+        <w:t>false-positive</w:t>
+      </w:r>
+      <w:r>
+        <w:rPr>
+          <w:rFonts w:hint="cs"/>
+          <w:color w:val="000000" w:themeColor="text1"/>
+          <w:rtl/>
+          <w:lang w:val="en-US" w:bidi="he-IL"/>
+        </w:rPr>
+        <w:t xml:space="preserve"> אז עדיף להשאיר ברמת סיכון נמוכה</w:t>
       </w:r>
     </w:p>
     <w:p>
@@ -2580,6 +2985,29 @@
           <w:rtl/>
           <w:lang w:bidi="he-IL"/>
         </w:rPr>
+        <w:t xml:space="preserve">כל קריטריון מקבל ניקוד על פי חומרתו ורמת האזהרה שלו, המערכת סורקת את הטקסט ועוברת על כל קריטריון בנפרד וצוברת ניקוד. </w:t>
+      </w:r>
+    </w:p>
+    <w:p>
+      <w:pPr>
+        <w:pStyle w:val="a4"/>
+        <w:numPr>
+          <w:ilvl w:val="0"/>
+          <w:numId w:val="14"/>
+        </w:numPr>
+        <w:bidi/>
+        <w:spacing w:after="120"/>
+        <w:rPr>
+          <w:color w:val="000000" w:themeColor="text1"/>
+        </w:rPr>
+      </w:pPr>
+      <w:r>
+        <w:rPr>
+          <w:rFonts w:hint="cs"/>
+          <w:color w:val="000000" w:themeColor="text1"/>
+          <w:rtl/>
+          <w:lang w:bidi="he-IL"/>
+        </w:rPr>
         <w:t xml:space="preserve">המערכת תזהה פישינג החל מ6 נקודות כי זה אומר שקיים לפחות אחד מהשילובים: קריטריון 1 מכל רמה </w:t>
       </w:r>
       <w:r>
@@ -2972,6 +3400,7 @@
           <w:color w:val="000000" w:themeColor="text1"/>
           <w:lang w:val="en-US"/>
         </w:rPr>
+        <w:lastRenderedPageBreak/>
         <w:t>result</w:t>
       </w:r>
       <w:r>
@@ -3082,7 +3511,6 @@
         <w:pStyle w:val="1"/>
         <w:bidi/>
         <w:rPr>
-          <w:rFonts w:hint="cs"/>
           <w:color w:val="000000" w:themeColor="text1"/>
           <w:rtl/>
           <w:lang w:val="en-US" w:bidi="he-IL"/>
@@ -3274,14 +3702,7 @@
           <w:color w:val="000000" w:themeColor="text1"/>
           <w:lang w:val="en-US" w:bidi="he-IL"/>
         </w:rPr>
-        <w:t xml:space="preserve">phishing </w:t>
-      </w:r>
-      <w:r>
-        <w:rPr>
-          <w:color w:val="000000" w:themeColor="text1"/>
-          <w:lang w:val="en-US" w:bidi="he-IL"/>
-        </w:rPr>
-        <w:t>tank</w:t>
+        <w:t>phishing tank</w:t>
       </w:r>
       <w:r>
         <w:rPr>
@@ -3348,7 +3769,6 @@
           <w:rtl/>
           <w:lang w:val="en-US" w:bidi="he-IL"/>
         </w:rPr>
-        <w:lastRenderedPageBreak/>
         <w:t>7</w:t>
       </w:r>
       <w:r>
@@ -3404,7 +3824,6 @@
               <w:bidi/>
               <w:spacing w:after="80"/>
               <w:rPr>
-                <w:rFonts w:hint="cs"/>
                 <w:color w:val="000000" w:themeColor="text1"/>
                 <w:rtl/>
                 <w:lang w:bidi="he-IL"/>
@@ -3430,7 +3849,6 @@
               <w:bidi/>
               <w:spacing w:after="80"/>
               <w:rPr>
-                <w:rFonts w:hint="cs"/>
                 <w:color w:val="000000" w:themeColor="text1"/>
                 <w:rtl/>
                 <w:lang w:bidi="he-IL"/>
@@ -3458,7 +3876,6 @@
               <w:bidi/>
               <w:spacing w:after="80"/>
               <w:rPr>
-                <w:rFonts w:hint="cs"/>
                 <w:color w:val="000000" w:themeColor="text1"/>
                 <w:rtl/>
                 <w:lang w:val="en-US" w:bidi="he-IL"/>
@@ -3482,7 +3899,6 @@
               <w:bidi/>
               <w:spacing w:after="80"/>
               <w:rPr>
-                <w:rFonts w:hint="cs"/>
                 <w:color w:val="000000" w:themeColor="text1"/>
                 <w:rtl/>
                 <w:lang w:val="en-US" w:bidi="he-IL"/>
@@ -3558,7 +3974,6 @@
               <w:bidi/>
               <w:spacing w:after="80"/>
               <w:rPr>
-                <w:rFonts w:hint="cs"/>
                 <w:color w:val="000000" w:themeColor="text1"/>
                 <w:rtl/>
                 <w:lang w:val="en-US" w:bidi="he-IL"/>
@@ -3591,7 +4006,6 @@
               <w:bidi/>
               <w:spacing w:after="80"/>
               <w:rPr>
-                <w:rFonts w:hint="cs"/>
                 <w:color w:val="000000" w:themeColor="text1"/>
                 <w:rtl/>
                 <w:lang w:val="en-US" w:bidi="he-IL"/>
@@ -3653,7 +4067,6 @@
         <w:bidi/>
         <w:spacing w:after="80"/>
         <w:rPr>
-          <w:rFonts w:hint="cs"/>
           <w:color w:val="000000" w:themeColor="text1"/>
           <w:lang w:bidi="he-IL"/>
         </w:rPr>

</xml_diff>